<commit_message>
twinkleclean.com.au — docx generator: grey tag/black heading text, real blue hyperlinks, single-doc output
Per client format feedback on the ringwood sample:
- Heading TAG (H1:/H2:/H3:) grey #595959; heading TEXT now black. Both bold, body size.
- Markdown links now render as REAL clickable hyperlinks in standard blue #0563C1,
  underlined, not bold. Previously the renderer had no link handling at all, so
  [text](url) would have output raw markdown brackets - defect caught in review.
- Single combined .docx, page break between pages, no table of contents.

Co-Authored-By: Claude Opus 4.8 <noreply@anthropic.com>
</commit_message>
<xml_diff>
--- a/clients/twinkleclean.com.au/content/exports/samples/SAMPLE-commercial-cleaning-ringwood.docx
+++ b/clients/twinkleclean.com.au/content/exports/samples/SAMPLE-commercial-cleaning-ringwood.docx
@@ -22,7 +22,15 @@
           <w:color w:val="595959"/>
           <w:sz w:val="22"/>
         </w:rPr>
-        <w:t>H1: Commercial Cleaning Ringwood Businesses Can Get To Quickly</w:t>
+        <w:t xml:space="preserve">H1: </w:t>
+      </w:r>
+      <w:r>
+        <w:rPr>
+          <w:b/>
+          <w:color w:val="000000"/>
+          <w:sz w:val="22"/>
+        </w:rPr>
+        <w:t>Commercial Cleaning Ringwood Businesses Can Get To Quickly</w:t>
       </w:r>
     </w:p>
     <w:p>
@@ -61,7 +69,15 @@
           <w:color w:val="595959"/>
           <w:sz w:val="22"/>
         </w:rPr>
-        <w:t>H2: Retail and shopfront cleaning around the activity centre</w:t>
+        <w:t xml:space="preserve">H2: </w:t>
+      </w:r>
+      <w:r>
+        <w:rPr>
+          <w:b/>
+          <w:color w:val="000000"/>
+          <w:sz w:val="22"/>
+        </w:rPr>
+        <w:t>Retail and shopfront cleaning around the activity centre</w:t>
       </w:r>
     </w:p>
     <w:p>
@@ -165,7 +181,25 @@
           <w:color w:val="000000"/>
           <w:sz w:val="22"/>
         </w:rPr>
-        <w:t>Environmentally conscious products are used wherever they suit the surface. Croydon traders after the same tenancy-first scheduling can read about it on our [commercial cleaning in Croydon](https://www.twinkleclean.com.au/commercial-cleaning-croydon/) page.</w:t>
+        <w:t xml:space="preserve">Environmentally conscious products are used wherever they suit the surface. Croydon traders after the same tenancy-first scheduling can read about it on our </w:t>
+      </w:r>
+      <w:hyperlink r:id="rId9">
+        <w:r>
+          <w:rPr>
+            <w:color w:val="0563C1"/>
+            <w:u w:val="single"/>
+            <w:sz w:val="22"/>
+          </w:rPr>
+          <w:t xml:space="preserve">commercial cleaning in Croydon</w:t>
+        </w:r>
+      </w:hyperlink>
+      <w:r>
+        <w:rPr>
+          <w:b w:val="0"/>
+          <w:color w:val="000000"/>
+          <w:sz w:val="22"/>
+        </w:rPr>
+        <w:t xml:space="preserve"> page.</w:t>
       </w:r>
     </w:p>
     <w:p>
@@ -178,7 +212,15 @@
           <w:color w:val="595959"/>
           <w:sz w:val="22"/>
         </w:rPr>
-        <w:t>H2: Office, civic and school sites along Maroondah Highway</w:t>
+        <w:t xml:space="preserve">H2: </w:t>
+      </w:r>
+      <w:r>
+        <w:rPr>
+          <w:b/>
+          <w:color w:val="000000"/>
+          <w:sz w:val="22"/>
+        </w:rPr>
+        <w:t>Office, civic and school sites along Maroondah Highway</w:t>
       </w:r>
     </w:p>
     <w:p>
@@ -204,7 +246,25 @@
           <w:color w:val="000000"/>
           <w:sz w:val="22"/>
         </w:rPr>
-        <w:t>For most of these, after-hours commercial cleaning is the only workable answer, and we run seven days a week including weekends and public holidays at no extra charge. Being a short drive away means an early start or a late finish is genuinely practical for us rather than something we tolerate. Our full method, equipment and credentials are on the [commercial cleaning Melbourne](https://www.twinkleclean.com.au/commercial-cleaning/) page.</w:t>
+        <w:t xml:space="preserve">For most of these, after-hours commercial cleaning is the only workable answer, and we run seven days a week including weekends and public holidays at no extra charge. Being a short drive away means an early start or a late finish is genuinely practical for us rather than something we tolerate. Our full method, equipment and credentials are on the </w:t>
+      </w:r>
+      <w:hyperlink r:id="rId10">
+        <w:r>
+          <w:rPr>
+            <w:color w:val="0563C1"/>
+            <w:u w:val="single"/>
+            <w:sz w:val="22"/>
+          </w:rPr>
+          <w:t xml:space="preserve">commercial cleaning Melbourne</w:t>
+        </w:r>
+      </w:hyperlink>
+      <w:r>
+        <w:rPr>
+          <w:b w:val="0"/>
+          <w:color w:val="000000"/>
+          <w:sz w:val="22"/>
+        </w:rPr>
+        <w:t xml:space="preserve"> page.</w:t>
       </w:r>
     </w:p>
     <w:p>
@@ -230,7 +290,15 @@
           <w:color w:val="595959"/>
           <w:sz w:val="22"/>
         </w:rPr>
-        <w:t>H2: The site types we look after in Ringwood</w:t>
+        <w:t xml:space="preserve">H2: </w:t>
+      </w:r>
+      <w:r>
+        <w:rPr>
+          <w:b/>
+          <w:color w:val="000000"/>
+          <w:sz w:val="22"/>
+        </w:rPr>
+        <w:t>The site types we look after in Ringwood</w:t>
       </w:r>
     </w:p>
     <w:p>
@@ -308,7 +376,15 @@
           <w:color w:val="595959"/>
           <w:sz w:val="22"/>
         </w:rPr>
-        <w:t>H2: Pricing</w:t>
+        <w:t xml:space="preserve">H2: </w:t>
+      </w:r>
+      <w:r>
+        <w:rPr>
+          <w:b/>
+          <w:color w:val="000000"/>
+          <w:sz w:val="22"/>
+        </w:rPr>
+        <w:t>Pricing</w:t>
       </w:r>
     </w:p>
     <w:p>
@@ -360,7 +436,15 @@
           <w:color w:val="595959"/>
           <w:sz w:val="22"/>
         </w:rPr>
-        <w:t>H2: About Twinkle Clean</w:t>
+        <w:t xml:space="preserve">H2: </w:t>
+      </w:r>
+      <w:r>
+        <w:rPr>
+          <w:b/>
+          <w:color w:val="000000"/>
+          <w:sz w:val="22"/>
+        </w:rPr>
+        <w:t>About Twinkle Clean</w:t>
       </w:r>
     </w:p>
     <w:p>
@@ -386,7 +470,15 @@
           <w:color w:val="595959"/>
           <w:sz w:val="22"/>
         </w:rPr>
-        <w:t>H2: Frequently asked questions</w:t>
+        <w:t xml:space="preserve">H2: </w:t>
+      </w:r>
+      <w:r>
+        <w:rPr>
+          <w:b/>
+          <w:color w:val="000000"/>
+          <w:sz w:val="22"/>
+        </w:rPr>
+        <w:t>Frequently asked questions</w:t>
       </w:r>
     </w:p>
     <w:p>
@@ -399,7 +491,15 @@
           <w:color w:val="595959"/>
           <w:sz w:val="22"/>
         </w:rPr>
-        <w:t>H3: Are your cleaners insured and police-checked?</w:t>
+        <w:t xml:space="preserve">H3: </w:t>
+      </w:r>
+      <w:r>
+        <w:rPr>
+          <w:b/>
+          <w:color w:val="000000"/>
+          <w:sz w:val="22"/>
+        </w:rPr>
+        <w:t>Are your cleaners insured and police-checked?</w:t>
       </w:r>
     </w:p>
     <w:p>
@@ -425,7 +525,15 @@
           <w:color w:val="595959"/>
           <w:sz w:val="22"/>
         </w:rPr>
-        <w:t>H3: Are your staff trained in workplace safety?</w:t>
+        <w:t xml:space="preserve">H3: </w:t>
+      </w:r>
+      <w:r>
+        <w:rPr>
+          <w:b/>
+          <w:color w:val="000000"/>
+          <w:sz w:val="22"/>
+        </w:rPr>
+        <w:t>Are your staff trained in workplace safety?</w:t>
       </w:r>
     </w:p>
     <w:p>
@@ -451,7 +559,15 @@
           <w:color w:val="595959"/>
           <w:sz w:val="22"/>
         </w:rPr>
-        <w:t>H3: Do you use OH&amp;S-compliant cleaning products?</w:t>
+        <w:t xml:space="preserve">H3: </w:t>
+      </w:r>
+      <w:r>
+        <w:rPr>
+          <w:b/>
+          <w:color w:val="000000"/>
+          <w:sz w:val="22"/>
+        </w:rPr>
+        <w:t>Do you use OH&amp;S-compliant cleaning products?</w:t>
       </w:r>
     </w:p>
     <w:p>
@@ -477,7 +593,15 @@
           <w:color w:val="595959"/>
           <w:sz w:val="22"/>
         </w:rPr>
-        <w:t>H3: Are you actually based in Ringwood?</w:t>
+        <w:t xml:space="preserve">H3: </w:t>
+      </w:r>
+      <w:r>
+        <w:rPr>
+          <w:b/>
+          <w:color w:val="000000"/>
+          <w:sz w:val="22"/>
+        </w:rPr>
+        <w:t>Are you actually based in Ringwood?</w:t>
       </w:r>
     </w:p>
     <w:p>
@@ -503,7 +627,15 @@
           <w:color w:val="595959"/>
           <w:sz w:val="22"/>
         </w:rPr>
-        <w:t>H3: Can you work around Eastland's access and trading hours?</w:t>
+        <w:t xml:space="preserve">H3: </w:t>
+      </w:r>
+      <w:r>
+        <w:rPr>
+          <w:b/>
+          <w:color w:val="000000"/>
+          <w:sz w:val="22"/>
+        </w:rPr>
+        <w:t>Can you work around Eastland's access and trading hours?</w:t>
       </w:r>
     </w:p>
     <w:p>
@@ -529,7 +661,15 @@
           <w:color w:val="595959"/>
           <w:sz w:val="22"/>
         </w:rPr>
-        <w:t>H3: Do you clean school and civic buildings in the area?</w:t>
+        <w:t xml:space="preserve">H3: </w:t>
+      </w:r>
+      <w:r>
+        <w:rPr>
+          <w:b/>
+          <w:color w:val="000000"/>
+          <w:sz w:val="22"/>
+        </w:rPr>
+        <w:t>Do you clean school and civic buildings in the area?</w:t>
       </w:r>
     </w:p>
     <w:p>
@@ -555,7 +695,15 @@
           <w:color w:val="595959"/>
           <w:sz w:val="22"/>
         </w:rPr>
-        <w:t>H3: Can you do a one-off clean before an inspection or handover?</w:t>
+        <w:t xml:space="preserve">H3: </w:t>
+      </w:r>
+      <w:r>
+        <w:rPr>
+          <w:b/>
+          <w:color w:val="000000"/>
+          <w:sz w:val="22"/>
+        </w:rPr>
+        <w:t>Can you do a one-off clean before an inspection or handover?</w:t>
       </w:r>
     </w:p>
     <w:p>
@@ -581,7 +729,15 @@
           <w:color w:val="595959"/>
           <w:sz w:val="22"/>
         </w:rPr>
-        <w:t>H3: How quickly can you reach a site in Ringwood?</w:t>
+        <w:t xml:space="preserve">H3: </w:t>
+      </w:r>
+      <w:r>
+        <w:rPr>
+          <w:b/>
+          <w:color w:val="000000"/>
+          <w:sz w:val="22"/>
+        </w:rPr>
+        <w:t>How quickly can you reach a site in Ringwood?</w:t>
       </w:r>
     </w:p>
     <w:p>
@@ -607,7 +763,15 @@
           <w:color w:val="595959"/>
           <w:sz w:val="22"/>
         </w:rPr>
-        <w:t>H2: Talk to your local team</w:t>
+        <w:t xml:space="preserve">H2: </w:t>
+      </w:r>
+      <w:r>
+        <w:rPr>
+          <w:b/>
+          <w:color w:val="000000"/>
+          <w:sz w:val="22"/>
+        </w:rPr>
+        <w:t>Talk to your local team</w:t>
       </w:r>
     </w:p>
     <w:p>

</xml_diff>